<commit_message>
feat(codonlm): implement non-linear MLP projection priors with parameter-efficient backbone   freezing
</commit_message>
<xml_diff>
--- a/conference/hayadata_abs.docx
+++ b/conference/hayadata_abs.docx
@@ -4,6 +4,224 @@
   <w:body>
     <w:p>
       <w:pPr>
+        <w:rPr>
+          <w:ins w:id="0" w:author="Avishai Barnoy" w:date="2026-06-18T22:12:00Z"/>
+          <w:lang w:val="en-IL" w:bidi="he-IL"/>
+        </w:rPr>
+      </w:pPr>
+      <w:ins w:id="1" w:author="Avishai Barnoy" w:date="2026-06-18T22:12:00Z">
+        <w:r>
+          <w:rPr>
+            <w:i/>
+            <w:iCs/>
+            <w:lang w:val="en-IL" w:bidi="he-IL"/>
+          </w:rPr>
+          <w:t>Focus: MLOps, memory optimization, local prototyping, and constraint-driven engineering. The fact that it is a DNA model is secondary to the hardware limitations.</w:t>
+        </w:r>
+      </w:ins>
+    </w:p>
+    <w:p>
+      <w:pPr>
+        <w:rPr>
+          <w:ins w:id="2" w:author="Avishai Barnoy" w:date="2026-06-18T22:12:00Z"/>
+          <w:lang w:val="en-IL" w:bidi="he-IL"/>
+        </w:rPr>
+      </w:pPr>
+      <w:ins w:id="3" w:author="Avishai Barnoy" w:date="2026-06-18T22:12:00Z">
+        <w:r>
+          <w:rPr>
+            <w:b/>
+            <w:bCs/>
+            <w:lang w:val="en-IL" w:bidi="he-IL"/>
+          </w:rPr>
+          <w:t>Session Title:</w:t>
+        </w:r>
+        <w:r>
+          <w:rPr>
+            <w:lang w:val="en-IL" w:bidi="he-IL"/>
+          </w:rPr>
+          <w:t xml:space="preserve"> From FASTA to Transformer: Training a Language Model on an 8GB Laptop</w:t>
+        </w:r>
+      </w:ins>
+    </w:p>
+    <w:p>
+      <w:pPr>
+        <w:rPr>
+          <w:ins w:id="4" w:author="Avishai Barnoy" w:date="2026-06-18T22:12:00Z"/>
+          <w:lang w:val="en-IL" w:bidi="he-IL"/>
+        </w:rPr>
+      </w:pPr>
+      <w:ins w:id="5" w:author="Avishai Barnoy" w:date="2026-06-18T22:12:00Z">
+        <w:r>
+          <w:rPr>
+            <w:b/>
+            <w:bCs/>
+            <w:lang w:val="en-IL" w:bidi="he-IL"/>
+          </w:rPr>
+          <w:t>Description:</w:t>
+        </w:r>
+        <w:r>
+          <w:rPr>
+            <w:lang w:val="en-IL" w:bidi="he-IL"/>
+          </w:rPr>
+          <w:t xml:space="preserve"> This talk breaks down the engineering decisions and optimizations required to build and train a sequence language model from scratch on an M2 MacBook with only 8 GB of memory. Rather than relying on cloud clusters, this project explores a strict engineering bottleneck: how far can you push transformer training when memory, not compute, is the absolute constraint?</w:t>
+        </w:r>
+      </w:ins>
+    </w:p>
+    <w:p>
+      <w:pPr>
+        <w:rPr>
+          <w:ins w:id="6" w:author="Avishai Barnoy" w:date="2026-06-18T22:12:00Z"/>
+          <w:lang w:val="en-IL" w:bidi="he-IL"/>
+        </w:rPr>
+      </w:pPr>
+      <w:ins w:id="7" w:author="Avishai Barnoy" w:date="2026-06-18T22:12:00Z">
+        <w:r>
+          <w:rPr>
+            <w:lang w:val="en-IL" w:bidi="he-IL"/>
+          </w:rPr>
+          <w:t>I will discuss the core pipeline adjustments needed to work around these hardware limitations, including low-footprint dataset preparation and memory-efficient tokenization. The talk covers the failure modes encountered under severe constraints—such as engineering the explicit halting conditions needed to stop the model from looping indefinitely—and how these limits forced an unexpected architectural shift from a single model to a micro-ecosystem of smaller, specialized networks that generate, critique, and guide each other.</w:t>
+        </w:r>
+      </w:ins>
+    </w:p>
+    <w:p>
+      <w:pPr>
+        <w:rPr>
+          <w:ins w:id="8" w:author="Avishai Barnoy" w:date="2026-06-18T22:12:00Z"/>
+          <w:lang w:val="en-IL" w:bidi="he-IL"/>
+        </w:rPr>
+      </w:pPr>
+      <w:ins w:id="9" w:author="Avishai Barnoy" w:date="2026-06-18T22:12:00Z">
+        <w:r>
+          <w:rPr>
+            <w:lang w:val="en-IL" w:bidi="he-IL"/>
+          </w:rPr>
+          <w:t>This session provides a practical framework for local model prototyping, demonstrating which consumer-hardware optimizations actually move the needle and why constraint-driven development is a powerful way to master modern AI mechanics.</w:t>
+        </w:r>
+      </w:ins>
+    </w:p>
+    <w:p>
+      <w:pPr>
+        <w:rPr>
+          <w:ins w:id="10" w:author="Avishai Barnoy" w:date="2026-06-18T22:12:00Z" w16du:dateUtc="2026-06-18T19:12:00Z"/>
+          <w:lang w:bidi="he-IL"/>
+        </w:rPr>
+      </w:pPr>
+    </w:p>
+    <w:p>
+      <w:pPr>
+        <w:rPr>
+          <w:ins w:id="11" w:author="Avishai Barnoy" w:date="2026-06-18T22:12:00Z"/>
+          <w:lang w:val="en-IL" w:bidi="he-IL"/>
+        </w:rPr>
+      </w:pPr>
+      <w:ins w:id="12" w:author="Avishai Barnoy" w:date="2026-06-18T22:12:00Z">
+        <w:r>
+          <w:rPr>
+            <w:i/>
+            <w:iCs/>
+            <w:lang w:val="en-IL" w:bidi="he-IL"/>
+          </w:rPr>
+          <w:t>Focus: Data Science, bioinformatics, domain-specific architectures, and adapting text-based NLP machinery to non-textual data structures (DNA).</w:t>
+        </w:r>
+      </w:ins>
+    </w:p>
+    <w:p>
+      <w:pPr>
+        <w:rPr>
+          <w:ins w:id="13" w:author="Avishai Barnoy" w:date="2026-06-18T22:12:00Z"/>
+          <w:lang w:val="en-IL" w:bidi="he-IL"/>
+        </w:rPr>
+      </w:pPr>
+      <w:ins w:id="14" w:author="Avishai Barnoy" w:date="2026-06-18T22:12:00Z">
+        <w:r>
+          <w:rPr>
+            <w:b/>
+            <w:bCs/>
+            <w:lang w:val="en-IL" w:bidi="he-IL"/>
+          </w:rPr>
+          <w:t>Session Title:</w:t>
+        </w:r>
+        <w:r>
+          <w:rPr>
+            <w:lang w:val="en-IL" w:bidi="he-IL"/>
+          </w:rPr>
+          <w:t xml:space="preserve"> Genomes as Text: Building a Domain-Specific Language Model for DNA</w:t>
+        </w:r>
+      </w:ins>
+    </w:p>
+    <w:p>
+      <w:pPr>
+        <w:rPr>
+          <w:ins w:id="15" w:author="Avishai Barnoy" w:date="2026-06-18T22:12:00Z"/>
+          <w:lang w:val="en-IL" w:bidi="he-IL"/>
+        </w:rPr>
+      </w:pPr>
+      <w:ins w:id="16" w:author="Avishai Barnoy" w:date="2026-06-18T22:12:00Z">
+        <w:r>
+          <w:rPr>
+            <w:b/>
+            <w:bCs/>
+            <w:lang w:val="en-IL" w:bidi="he-IL"/>
+          </w:rPr>
+          <w:t>Description:</w:t>
+        </w:r>
+        <w:r>
+          <w:rPr>
+            <w:lang w:val="en-IL" w:bidi="he-IL"/>
+          </w:rPr>
+          <w:t xml:space="preserve"> Natural Language Processing tools are optimized for human grammar, but how do they translate to the structural rules of biological sequences? This talk covers the development of a domain-specific transformer trained from scratch to process DNA sequence data instead of text.</w:t>
+        </w:r>
+      </w:ins>
+    </w:p>
+    <w:p>
+      <w:pPr>
+        <w:rPr>
+          <w:ins w:id="17" w:author="Avishai Barnoy" w:date="2026-06-18T22:12:00Z"/>
+          <w:lang w:val="en-IL" w:bidi="he-IL"/>
+        </w:rPr>
+      </w:pPr>
+      <w:ins w:id="18" w:author="Avishai Barnoy" w:date="2026-06-18T22:12:00Z">
+        <w:r>
+          <w:rPr>
+            <w:lang w:val="en-IL" w:bidi="he-IL"/>
+          </w:rPr>
+          <w:t>We will explore the unique challenges of adapting NLP machinery to genomics, focusing on DNA representation, tokenization strategies for nucleotide bases, and handling data preparation without standard semantic anchors. The talk highlights how biological realism interacts with model architecture, including the specific failure modes of treating genetic code as language—such as the structural fixes required to teach a biological sequence model how to correctly terminate a generation. Finally, we will look at how this domain shift led to an ecosystem of specialized networks that generate, critique, and guide sequence production.</w:t>
+        </w:r>
+      </w:ins>
+    </w:p>
+    <w:p>
+      <w:pPr>
+        <w:rPr>
+          <w:ins w:id="19" w:author="Avishai Barnoy" w:date="2026-06-18T22:12:00Z"/>
+          <w:lang w:val="en-IL" w:bidi="he-IL"/>
+        </w:rPr>
+      </w:pPr>
+      <w:ins w:id="20" w:author="Avishai Barnoy" w:date="2026-06-18T22:12:00Z">
+        <w:r>
+          <w:rPr>
+            <w:lang w:val="en-IL" w:bidi="he-IL"/>
+          </w:rPr>
+          <w:lastRenderedPageBreak/>
+          <w:t>Attendees will leave with a clear understanding of the architectural and tokenization trade-offs required to adapt language models to non-linguistic, domain-specific scientific datasets.</w:t>
+        </w:r>
+      </w:ins>
+    </w:p>
+    <w:p>
+      <w:pPr>
+        <w:rPr>
+          <w:ins w:id="21" w:author="Avishai Barnoy" w:date="2026-06-18T22:11:00Z" w16du:dateUtc="2026-06-18T19:11:00Z"/>
+          <w:lang w:bidi="he-IL"/>
+        </w:rPr>
+        <w:pPrChange w:id="22" w:author="Avishai Barnoy" w:date="2026-06-18T22:11:00Z" w16du:dateUtc="2026-06-18T19:11:00Z">
+          <w:pPr>
+            <w:pStyle w:val="Heading2"/>
+          </w:pPr>
+        </w:pPrChange>
+      </w:pPr>
+    </w:p>
+    <w:p>
+      <w:pPr>
         <w:pStyle w:val="Heading2"/>
         <w:rPr>
           <w:rFonts w:ascii="Calibri" w:hAnsi="Calibri" w:cs="Calibri"/>
@@ -15,24 +233,38 @@
           <w:rFonts w:ascii="Calibri" w:hAnsi="Calibri" w:cs="Calibri"/>
           <w:lang w:bidi="he-IL"/>
         </w:rPr>
-        <w:t>Proposal 4: MLOps / Practical ML (Case Study)</w:t>
-      </w:r>
-    </w:p>
-    <w:p>
-      <w:pPr>
-        <w:jc w:val="both"/>
-        <w:rPr>
-          <w:rFonts w:ascii="Calibri" w:hAnsi="Calibri" w:cs="Calibri"/>
-          <w:lang w:bidi="he-IL"/>
-        </w:rPr>
-      </w:pPr>
-      <w:r>
-        <w:rPr>
-          <w:rFonts w:ascii="Calibri" w:hAnsi="Calibri" w:cs="Calibri"/>
-          <w:lang w:bidi="he-IL"/>
-        </w:rPr>
-        <w:t xml:space="preserve">    • </w:t>
-      </w:r>
+        <w:t xml:space="preserve">Proposal 4: </w:t>
+      </w:r>
+      <w:proofErr w:type="spellStart"/>
+      <w:r>
+        <w:rPr>
+          <w:rFonts w:ascii="Calibri" w:hAnsi="Calibri" w:cs="Calibri"/>
+          <w:lang w:bidi="he-IL"/>
+        </w:rPr>
+        <w:t>MLOps</w:t>
+      </w:r>
+      <w:proofErr w:type="spellEnd"/>
+      <w:r>
+        <w:rPr>
+          <w:rFonts w:ascii="Calibri" w:hAnsi="Calibri" w:cs="Calibri"/>
+          <w:lang w:bidi="he-IL"/>
+        </w:rPr>
+        <w:t xml:space="preserve"> / Practical ML (Case Study)</w:t>
+      </w:r>
+    </w:p>
+    <w:p>
+      <w:pPr>
+        <w:pStyle w:val="ListParagraph"/>
+        <w:numPr>
+          <w:ilvl w:val="0"/>
+          <w:numId w:val="2"/>
+        </w:numPr>
+        <w:jc w:val="both"/>
+        <w:rPr>
+          <w:rFonts w:ascii="Calibri" w:hAnsi="Calibri" w:cs="Calibri"/>
+          <w:lang w:bidi="he-IL"/>
+        </w:rPr>
+      </w:pPr>
       <w:r>
         <w:rPr>
           <w:rFonts w:ascii="Calibri" w:hAnsi="Calibri" w:cs="Calibri"/>
@@ -56,31 +288,22 @@
           <w:rFonts w:ascii="Calibri" w:hAnsi="Calibri" w:cs="Calibri"/>
           <w:lang w:bidi="he-IL"/>
         </w:rPr>
-        <w:t>F</w:t>
-      </w:r>
-      <w:r>
-        <w:rPr>
-          <w:rFonts w:ascii="Calibri" w:hAnsi="Calibri" w:cs="Calibri"/>
-          <w:lang w:bidi="he-IL"/>
-        </w:rPr>
-        <w:t>rom FASTA to Transformer: How I Trained a DNA Language Model on Cheap Laptop</w:t>
-      </w:r>
-    </w:p>
-    <w:p>
-      <w:pPr>
-        <w:jc w:val="both"/>
-        <w:rPr>
-          <w:rFonts w:ascii="Calibri" w:hAnsi="Calibri" w:cs="Calibri"/>
-          <w:lang w:bidi="he-IL"/>
-        </w:rPr>
-      </w:pPr>
-      <w:r>
-        <w:rPr>
-          <w:rFonts w:ascii="Calibri" w:hAnsi="Calibri" w:cs="Calibri"/>
-          <w:lang w:bidi="he-IL"/>
-        </w:rPr>
-        <w:t xml:space="preserve">    • </w:t>
-      </w:r>
+        <w:t>From FASTA to Transformer: How I Trained a DNA Language Model on Cheap Laptop</w:t>
+      </w:r>
+    </w:p>
+    <w:p>
+      <w:pPr>
+        <w:pStyle w:val="ListParagraph"/>
+        <w:numPr>
+          <w:ilvl w:val="0"/>
+          <w:numId w:val="2"/>
+        </w:numPr>
+        <w:jc w:val="both"/>
+        <w:rPr>
+          <w:rFonts w:ascii="Calibri" w:hAnsi="Calibri" w:cs="Calibri"/>
+          <w:lang w:bidi="he-IL"/>
+        </w:rPr>
+      </w:pPr>
       <w:r>
         <w:rPr>
           <w:rFonts w:ascii="Calibri" w:hAnsi="Calibri" w:cs="Calibri"/>
@@ -95,24 +318,38 @@
           <w:rFonts w:ascii="Calibri" w:hAnsi="Calibri" w:cs="Calibri"/>
           <w:lang w:bidi="he-IL"/>
         </w:rPr>
-        <w:t xml:space="preserve"> MLOps / Practical ML (or Data Science / ML)</w:t>
-      </w:r>
-    </w:p>
-    <w:p>
-      <w:pPr>
-        <w:jc w:val="both"/>
-        <w:rPr>
-          <w:rFonts w:ascii="Calibri" w:hAnsi="Calibri" w:cs="Calibri"/>
-          <w:lang w:bidi="he-IL"/>
-        </w:rPr>
-      </w:pPr>
-      <w:r>
-        <w:rPr>
-          <w:rFonts w:ascii="Calibri" w:hAnsi="Calibri" w:cs="Calibri"/>
-          <w:lang w:bidi="he-IL"/>
-        </w:rPr>
-        <w:t xml:space="preserve">    • </w:t>
-      </w:r>
+        <w:t xml:space="preserve"> </w:t>
+      </w:r>
+      <w:proofErr w:type="spellStart"/>
+      <w:r>
+        <w:rPr>
+          <w:rFonts w:ascii="Calibri" w:hAnsi="Calibri" w:cs="Calibri"/>
+          <w:lang w:bidi="he-IL"/>
+        </w:rPr>
+        <w:t>MLOps</w:t>
+      </w:r>
+      <w:proofErr w:type="spellEnd"/>
+      <w:r>
+        <w:rPr>
+          <w:rFonts w:ascii="Calibri" w:hAnsi="Calibri" w:cs="Calibri"/>
+          <w:lang w:bidi="he-IL"/>
+        </w:rPr>
+        <w:t xml:space="preserve"> / Practical ML (or Data Science / ML)</w:t>
+      </w:r>
+    </w:p>
+    <w:p>
+      <w:pPr>
+        <w:pStyle w:val="ListParagraph"/>
+        <w:numPr>
+          <w:ilvl w:val="0"/>
+          <w:numId w:val="2"/>
+        </w:numPr>
+        <w:jc w:val="both"/>
+        <w:rPr>
+          <w:rFonts w:ascii="Calibri" w:hAnsi="Calibri" w:cs="Calibri"/>
+          <w:lang w:bidi="he-IL"/>
+        </w:rPr>
+      </w:pPr>
       <w:r>
         <w:rPr>
           <w:rFonts w:ascii="Calibri" w:hAnsi="Calibri" w:cs="Calibri"/>
@@ -132,19 +369,17 @@
     </w:p>
     <w:p>
       <w:pPr>
-        <w:jc w:val="both"/>
-        <w:rPr>
-          <w:rFonts w:ascii="Calibri" w:hAnsi="Calibri" w:cs="Calibri"/>
-          <w:lang w:bidi="he-IL"/>
-        </w:rPr>
-      </w:pPr>
-      <w:r>
-        <w:rPr>
-          <w:rFonts w:ascii="Calibri" w:hAnsi="Calibri" w:cs="Calibri"/>
-          <w:lang w:bidi="he-IL"/>
-        </w:rPr>
-        <w:t xml:space="preserve">    • </w:t>
-      </w:r>
+        <w:pStyle w:val="ListParagraph"/>
+        <w:numPr>
+          <w:ilvl w:val="0"/>
+          <w:numId w:val="2"/>
+        </w:numPr>
+        <w:jc w:val="both"/>
+        <w:rPr>
+          <w:rFonts w:ascii="Calibri" w:hAnsi="Calibri" w:cs="Calibri"/>
+          <w:lang w:bidi="he-IL"/>
+        </w:rPr>
+      </w:pPr>
       <w:r>
         <w:rPr>
           <w:rFonts w:ascii="Calibri" w:hAnsi="Calibri" w:cs="Calibri"/>
@@ -173,11 +408,30 @@
           <w:rFonts w:ascii="Calibri" w:hAnsi="Calibri" w:cs="Calibri"/>
           <w:lang w:bidi="he-IL"/>
         </w:rPr>
-        <w:t>-minute Talk</w:t>
-      </w:r>
-    </w:p>
-    <w:p>
-      <w:pPr>
+        <w:t>-minute</w:t>
+      </w:r>
+      <w:r>
+        <w:rPr>
+          <w:rFonts w:ascii="Calibri" w:hAnsi="Calibri" w:cs="Calibri"/>
+          <w:lang w:bidi="he-IL"/>
+        </w:rPr>
+        <w:t xml:space="preserve"> / 30-minute</w:t>
+      </w:r>
+      <w:r>
+        <w:rPr>
+          <w:rFonts w:ascii="Calibri" w:hAnsi="Calibri" w:cs="Calibri"/>
+          <w:lang w:bidi="he-IL"/>
+        </w:rPr>
+        <w:t xml:space="preserve"> Talk</w:t>
+      </w:r>
+    </w:p>
+    <w:p>
+      <w:pPr>
+        <w:pStyle w:val="ListParagraph"/>
+        <w:numPr>
+          <w:ilvl w:val="0"/>
+          <w:numId w:val="2"/>
+        </w:numPr>
         <w:jc w:val="both"/>
         <w:rPr>
           <w:rFonts w:ascii="Calibri" w:hAnsi="Calibri" w:cs="Calibri"/>
@@ -189,13 +443,6 @@
       <w:r>
         <w:rPr>
           <w:rFonts w:ascii="Calibri" w:hAnsi="Calibri" w:cs="Calibri"/>
-          <w:lang w:bidi="he-IL"/>
-        </w:rPr>
-        <w:t xml:space="preserve">    • </w:t>
-      </w:r>
-      <w:r>
-        <w:rPr>
-          <w:rFonts w:ascii="Calibri" w:hAnsi="Calibri" w:cs="Calibri"/>
           <w:b/>
           <w:bCs/>
           <w:lang w:bidi="he-IL"/>
@@ -216,7 +463,65 @@
           <w:rFonts w:ascii="Calibri" w:hAnsi="Calibri" w:cs="Calibri"/>
           <w:lang w:val="en-IL" w:bidi="he-IL"/>
         </w:rPr>
-        <w:t>Training modern language models is often associated with massive GPU clusters and</w:t>
+        <w:t xml:space="preserve">When you think of language models </w:t>
+      </w:r>
+      <w:r>
+        <w:rPr>
+          <w:rFonts w:ascii="Calibri" w:hAnsi="Calibri" w:cs="Calibri"/>
+          <w:lang w:val="en-IL" w:bidi="he-IL"/>
+        </w:rPr>
+        <w:t xml:space="preserve">what comes to mind are </w:t>
+      </w:r>
+      <w:r>
+        <w:rPr>
+          <w:rFonts w:ascii="Calibri" w:hAnsi="Calibri" w:cs="Calibri"/>
+          <w:lang w:val="en-IL" w:bidi="he-IL"/>
+        </w:rPr>
+        <w:t xml:space="preserve">massive GPU clusters, and companies like OpenAI, Antropic and Nvidia. But what if I tried to train a </w:t>
+      </w:r>
+      <w:r>
+        <w:rPr>
+          <w:rFonts w:ascii="Calibri" w:hAnsi="Calibri" w:cs="Calibri"/>
+          <w:lang w:val="en-IL" w:bidi="he-IL"/>
+        </w:rPr>
+        <w:t xml:space="preserve">domain-specific </w:t>
+      </w:r>
+      <w:r>
+        <w:rPr>
+          <w:rFonts w:ascii="Calibri" w:hAnsi="Calibri" w:cs="Calibri"/>
+          <w:lang w:val="en-IL" w:bidi="he-IL"/>
+        </w:rPr>
+        <w:t>model on my own PC?</w:t>
+      </w:r>
+    </w:p>
+    <w:p>
+      <w:pPr>
+        <w:jc w:val="both"/>
+        <w:rPr>
+          <w:rFonts w:ascii="Calibri" w:hAnsi="Calibri" w:cs="Calibri"/>
+          <w:lang w:val="en-IL" w:bidi="he-IL"/>
+        </w:rPr>
+      </w:pPr>
+      <w:r>
+        <w:rPr>
+          <w:rFonts w:ascii="Calibri" w:hAnsi="Calibri" w:cs="Calibri"/>
+          <w:lang w:val="en-IL" w:bidi="he-IL"/>
+        </w:rPr>
+        <w:t xml:space="preserve">In this talk, I will </w:t>
+      </w:r>
+      <w:r>
+        <w:rPr>
+          <w:rFonts w:ascii="Calibri" w:hAnsi="Calibri" w:cs="Calibri"/>
+          <w:lang w:val="en-IL" w:bidi="he-IL"/>
+        </w:rPr>
+        <w:t xml:space="preserve">show </w:t>
+      </w:r>
+      <w:r>
+        <w:rPr>
+          <w:rFonts w:ascii="Calibri" w:hAnsi="Calibri" w:cs="Calibri"/>
+          <w:lang w:val="en-IL" w:bidi="he-IL"/>
+        </w:rPr>
+        <w:t>how I</w:t>
       </w:r>
       <w:r>
         <w:rPr>
@@ -230,7 +535,28 @@
           <w:rFonts w:ascii="Calibri" w:hAnsi="Calibri" w:cs="Calibri"/>
           <w:lang w:val="en-IL" w:bidi="he-IL"/>
         </w:rPr>
-        <w:t>cloud budgets</w:t>
+        <w:t>buil</w:t>
+      </w:r>
+      <w:r>
+        <w:rPr>
+          <w:rFonts w:ascii="Calibri" w:hAnsi="Calibri" w:cs="Calibri"/>
+          <w:lang w:val="en-IL" w:bidi="he-IL"/>
+        </w:rPr>
+        <w:t>t</w:t>
+      </w:r>
+      <w:r>
+        <w:rPr>
+          <w:rFonts w:ascii="Calibri" w:hAnsi="Calibri" w:cs="Calibri"/>
+          <w:lang w:val="en-IL" w:bidi="he-IL"/>
+        </w:rPr>
+        <w:t xml:space="preserve"> and train</w:t>
+      </w:r>
+      <w:r>
+        <w:rPr>
+          <w:rFonts w:ascii="Calibri" w:hAnsi="Calibri" w:cs="Calibri"/>
+          <w:lang w:val="en-IL" w:bidi="he-IL"/>
+        </w:rPr>
+        <w:t>ed</w:t>
       </w:r>
       <w:r>
         <w:rPr>
@@ -244,42 +570,277 @@
           <w:rFonts w:ascii="Calibri" w:hAnsi="Calibri" w:cs="Calibri"/>
           <w:lang w:val="en-IL" w:bidi="he-IL"/>
         </w:rPr>
-        <w:t xml:space="preserve">that </w:t>
-      </w:r>
-      <w:r>
-        <w:rPr>
-          <w:rFonts w:ascii="Calibri" w:hAnsi="Calibri" w:cs="Calibri"/>
-          <w:lang w:val="en-IL" w:bidi="he-IL"/>
-        </w:rPr>
-        <w:t xml:space="preserve">are far beyond the reach of </w:t>
-      </w:r>
-      <w:r>
-        <w:rPr>
-          <w:rFonts w:ascii="Calibri" w:hAnsi="Calibri" w:cs="Calibri"/>
-          <w:lang w:val="en-IL" w:bidi="he-IL"/>
-        </w:rPr>
-        <w:t>AI hobbyists, and g</w:t>
-      </w:r>
-      <w:r>
-        <w:rPr>
-          <w:rFonts w:ascii="Calibri" w:hAnsi="Calibri" w:cs="Calibri"/>
-          <w:lang w:val="en-IL" w:bidi="he-IL"/>
-        </w:rPr>
-        <w:t>enomic</w:t>
-      </w:r>
-      <w:r>
-        <w:rPr>
-          <w:rFonts w:ascii="Calibri" w:hAnsi="Calibri" w:cs="Calibri"/>
-          <w:lang w:val="en-IL" w:bidi="he-IL"/>
-        </w:rPr>
-        <w:t>s</w:t>
-      </w:r>
-      <w:r>
-        <w:rPr>
-          <w:rFonts w:ascii="Calibri" w:hAnsi="Calibri" w:cs="Calibri"/>
-          <w:lang w:val="en-IL" w:bidi="he-IL"/>
-        </w:rPr>
-        <w:t xml:space="preserve"> models are no exception</w:t>
+        <w:t xml:space="preserve">a DNA language model from scratch on an M2 MacBook with only 8 GB of memory. Rather than </w:t>
+      </w:r>
+      <w:r>
+        <w:rPr>
+          <w:rFonts w:ascii="Calibri" w:hAnsi="Calibri" w:cs="Calibri"/>
+          <w:lang w:val="en-IL" w:bidi="he-IL"/>
+        </w:rPr>
+        <w:t>competing</w:t>
+      </w:r>
+      <w:r>
+        <w:rPr>
+          <w:rFonts w:ascii="Calibri" w:hAnsi="Calibri" w:cs="Calibri"/>
+          <w:lang w:val="en-IL" w:bidi="he-IL"/>
+        </w:rPr>
+        <w:t xml:space="preserve"> </w:t>
+      </w:r>
+      <w:r>
+        <w:rPr>
+          <w:rFonts w:ascii="Calibri" w:hAnsi="Calibri" w:cs="Calibri"/>
+          <w:lang w:val="en-IL" w:bidi="he-IL"/>
+        </w:rPr>
+        <w:t xml:space="preserve">with </w:t>
+      </w:r>
+      <w:r>
+        <w:rPr>
+          <w:rFonts w:ascii="Calibri" w:hAnsi="Calibri" w:cs="Calibri"/>
+          <w:lang w:val="en-IL" w:bidi="he-IL"/>
+        </w:rPr>
+        <w:t xml:space="preserve">state-of-the-art </w:t>
+      </w:r>
+      <w:r>
+        <w:rPr>
+          <w:rFonts w:ascii="Calibri" w:hAnsi="Calibri" w:cs="Calibri"/>
+          <w:lang w:val="en-IL" w:bidi="he-IL"/>
+        </w:rPr>
+        <w:t>models</w:t>
+      </w:r>
+      <w:r>
+        <w:rPr>
+          <w:rFonts w:ascii="Calibri" w:hAnsi="Calibri" w:cs="Calibri"/>
+          <w:lang w:val="en-IL" w:bidi="he-IL"/>
+        </w:rPr>
+        <w:t xml:space="preserve">, I </w:t>
+      </w:r>
+      <w:r>
+        <w:rPr>
+          <w:rFonts w:ascii="Calibri" w:hAnsi="Calibri" w:cs="Calibri"/>
+          <w:lang w:val="en-IL" w:bidi="he-IL"/>
+        </w:rPr>
+        <w:t xml:space="preserve">asked </w:t>
+      </w:r>
+      <w:r>
+        <w:rPr>
+          <w:rFonts w:ascii="Calibri" w:hAnsi="Calibri" w:cs="Calibri"/>
+          <w:lang w:val="en-IL" w:bidi="he-IL"/>
+        </w:rPr>
+        <w:t xml:space="preserve">a different question: how far can </w:t>
+      </w:r>
+      <w:r>
+        <w:rPr>
+          <w:rFonts w:ascii="Calibri" w:hAnsi="Calibri" w:cs="Calibri"/>
+          <w:lang w:val="en-IL" w:bidi="he-IL"/>
+        </w:rPr>
+        <w:t>I push</w:t>
+      </w:r>
+      <w:r>
+        <w:rPr>
+          <w:rFonts w:ascii="Calibri" w:hAnsi="Calibri" w:cs="Calibri"/>
+          <w:lang w:val="en-IL" w:bidi="he-IL"/>
+        </w:rPr>
+        <w:t xml:space="preserve"> </w:t>
+      </w:r>
+      <w:r>
+        <w:rPr>
+          <w:rFonts w:ascii="Calibri" w:hAnsi="Calibri" w:cs="Calibri"/>
+          <w:lang w:val="en-IL" w:bidi="he-IL"/>
+        </w:rPr>
+        <w:t>a language model when memory, not compute, is the main constraint?</w:t>
+      </w:r>
+      <w:r>
+        <w:rPr>
+          <w:rFonts w:ascii="Calibri" w:hAnsi="Calibri" w:cs="Calibri"/>
+          <w:lang w:val="en-IL" w:bidi="he-IL"/>
+        </w:rPr>
+        <w:t xml:space="preserve"> And what can I learn </w:t>
+      </w:r>
+      <w:r>
+        <w:rPr>
+          <w:rFonts w:ascii="Calibri" w:hAnsi="Calibri" w:cs="Calibri"/>
+          <w:lang w:val="en-IL" w:bidi="he-IL"/>
+        </w:rPr>
+        <w:t>along</w:t>
+      </w:r>
+      <w:r>
+        <w:rPr>
+          <w:rFonts w:ascii="Calibri" w:hAnsi="Calibri" w:cs="Calibri"/>
+          <w:lang w:val="en-IL" w:bidi="he-IL"/>
+        </w:rPr>
+        <w:t xml:space="preserve"> the way.</w:t>
+      </w:r>
+    </w:p>
+    <w:p>
+      <w:pPr>
+        <w:jc w:val="both"/>
+        <w:rPr>
+          <w:rFonts w:ascii="Calibri" w:hAnsi="Calibri" w:cs="Calibri"/>
+          <w:lang w:bidi="he-IL"/>
+        </w:rPr>
+      </w:pPr>
+      <w:r>
+        <w:rPr>
+          <w:rFonts w:ascii="Calibri" w:hAnsi="Calibri" w:cs="Calibri"/>
+          <w:lang w:val="en-IL" w:bidi="he-IL"/>
+        </w:rPr>
+        <w:t xml:space="preserve">I will </w:t>
+      </w:r>
+      <w:r>
+        <w:rPr>
+          <w:rFonts w:ascii="Calibri" w:hAnsi="Calibri" w:cs="Calibri"/>
+          <w:lang w:val="en-IL" w:bidi="he-IL"/>
+        </w:rPr>
+        <w:t>discuss</w:t>
+      </w:r>
+      <w:r>
+        <w:rPr>
+          <w:rFonts w:ascii="Calibri" w:hAnsi="Calibri" w:cs="Calibri"/>
+          <w:lang w:val="en-IL" w:bidi="he-IL"/>
+        </w:rPr>
+        <w:t xml:space="preserve"> </w:t>
+      </w:r>
+      <w:r>
+        <w:rPr>
+          <w:rFonts w:ascii="Calibri" w:hAnsi="Calibri" w:cs="Calibri"/>
+          <w:lang w:val="en-IL" w:bidi="he-IL"/>
+        </w:rPr>
+        <w:t xml:space="preserve">design decisions </w:t>
+      </w:r>
+      <w:r>
+        <w:rPr>
+          <w:rFonts w:ascii="Calibri" w:hAnsi="Calibri" w:cs="Calibri"/>
+          <w:lang w:val="en-IL" w:bidi="he-IL"/>
+        </w:rPr>
+        <w:t xml:space="preserve">for </w:t>
+      </w:r>
+      <w:r>
+        <w:rPr>
+          <w:rFonts w:ascii="Calibri" w:hAnsi="Calibri" w:cs="Calibri"/>
+          <w:lang w:val="en-IL" w:bidi="he-IL"/>
+        </w:rPr>
+        <w:t>the project</w:t>
+      </w:r>
+      <w:r>
+        <w:rPr>
+          <w:rFonts w:ascii="Calibri" w:hAnsi="Calibri" w:cs="Calibri"/>
+          <w:lang w:val="en-IL" w:bidi="he-IL"/>
+        </w:rPr>
+        <w:t xml:space="preserve"> structure</w:t>
+      </w:r>
+      <w:r>
+        <w:rPr>
+          <w:rFonts w:ascii="Calibri" w:hAnsi="Calibri" w:cs="Calibri"/>
+          <w:lang w:val="en-IL" w:bidi="he-IL"/>
+        </w:rPr>
+        <w:t>, DNA tokenization</w:t>
+      </w:r>
+      <w:r>
+        <w:rPr>
+          <w:rFonts w:ascii="Calibri" w:hAnsi="Calibri" w:cs="Calibri"/>
+          <w:lang w:val="en-IL" w:bidi="he-IL"/>
+        </w:rPr>
+        <w:t xml:space="preserve"> and</w:t>
+      </w:r>
+      <w:r>
+        <w:rPr>
+          <w:rFonts w:ascii="Calibri" w:hAnsi="Calibri" w:cs="Calibri"/>
+          <w:lang w:val="en-IL" w:bidi="he-IL"/>
+        </w:rPr>
+        <w:t xml:space="preserve"> </w:t>
+      </w:r>
+      <w:r>
+        <w:rPr>
+          <w:rFonts w:ascii="Calibri" w:hAnsi="Calibri" w:cs="Calibri"/>
+          <w:lang w:val="en-IL" w:bidi="he-IL"/>
+        </w:rPr>
+        <w:t>dataset preparation</w:t>
+      </w:r>
+      <w:r>
+        <w:rPr>
+          <w:rFonts w:ascii="Calibri" w:hAnsi="Calibri" w:cs="Calibri"/>
+          <w:lang w:val="en-IL" w:bidi="he-IL"/>
+        </w:rPr>
+        <w:t xml:space="preserve">, </w:t>
+      </w:r>
+      <w:r>
+        <w:rPr>
+          <w:rFonts w:ascii="Calibri" w:hAnsi="Calibri" w:cs="Calibri"/>
+          <w:lang w:val="en-IL" w:bidi="he-IL"/>
+        </w:rPr>
+        <w:t>working around memory limits</w:t>
+      </w:r>
+      <w:r>
+        <w:rPr>
+          <w:rFonts w:ascii="Calibri" w:hAnsi="Calibri" w:cs="Calibri"/>
+          <w:lang w:val="en-IL" w:bidi="he-IL"/>
+        </w:rPr>
+        <w:t>, evaluation methods</w:t>
+      </w:r>
+      <w:r>
+        <w:rPr>
+          <w:rFonts w:ascii="Calibri" w:hAnsi="Calibri" w:cs="Calibri"/>
+          <w:lang w:val="en-IL" w:bidi="he-IL"/>
+        </w:rPr>
+        <w:t xml:space="preserve"> </w:t>
+      </w:r>
+      <w:r>
+        <w:rPr>
+          <w:rFonts w:ascii="Calibri" w:hAnsi="Calibri" w:cs="Calibri"/>
+          <w:lang w:bidi="he-IL"/>
+        </w:rPr>
+        <w:t>and an unexpected shift from a single model to a small ecosystem of specialized models that generate, critique, and guide each other.</w:t>
+      </w:r>
+      <w:r>
+        <w:rPr>
+          <w:rFonts w:ascii="Calibri" w:hAnsi="Calibri" w:cs="Calibri"/>
+          <w:lang w:bidi="he-IL"/>
+        </w:rPr>
+        <w:t xml:space="preserve"> We will see where my model succeeds, where it fails and especially how I finally got my model to learn how to stop talking.</w:t>
+      </w:r>
+    </w:p>
+    <w:p>
+      <w:pPr>
+        <w:jc w:val="both"/>
+        <w:rPr>
+          <w:rFonts w:ascii="Calibri" w:hAnsi="Calibri" w:cs="Calibri"/>
+          <w:lang w:val="en-IL" w:bidi="he-IL"/>
+        </w:rPr>
+      </w:pPr>
+      <w:r>
+        <w:rPr>
+          <w:rFonts w:ascii="Calibri" w:hAnsi="Calibri" w:cs="Calibri"/>
+          <w:lang w:val="en-IL" w:bidi="he-IL"/>
+        </w:rPr>
+        <w:t xml:space="preserve">The audience might </w:t>
+      </w:r>
+      <w:r>
+        <w:rPr>
+          <w:rFonts w:ascii="Calibri" w:hAnsi="Calibri" w:cs="Calibri"/>
+          <w:lang w:val="en-IL" w:bidi="he-IL"/>
+        </w:rPr>
+        <w:t xml:space="preserve">leave </w:t>
+      </w:r>
+      <w:r>
+        <w:rPr>
+          <w:rFonts w:ascii="Calibri" w:hAnsi="Calibri" w:cs="Calibri"/>
+          <w:lang w:val="en-IL" w:bidi="he-IL"/>
+        </w:rPr>
+        <w:t>or leave</w:t>
+      </w:r>
+      <w:r>
+        <w:rPr>
+          <w:rFonts w:ascii="Calibri" w:hAnsi="Calibri" w:cs="Calibri"/>
+          <w:lang w:val="en-IL" w:bidi="he-IL"/>
+        </w:rPr>
+        <w:t xml:space="preserve"> </w:t>
+      </w:r>
+      <w:r>
+        <w:rPr>
+          <w:rFonts w:ascii="Calibri" w:hAnsi="Calibri" w:cs="Calibri"/>
+          <w:lang w:val="en-IL" w:bidi="he-IL"/>
+        </w:rPr>
+        <w:t>learning from my journey</w:t>
       </w:r>
       <w:r>
         <w:rPr>
@@ -288,43 +849,6 @@
         </w:rPr>
         <w:t>.</w:t>
       </w:r>
-    </w:p>
-    <w:p>
-      <w:pPr>
-        <w:jc w:val="both"/>
-        <w:rPr>
-          <w:rFonts w:ascii="Calibri" w:hAnsi="Calibri" w:cs="Calibri"/>
-          <w:lang w:val="en-IL" w:bidi="he-IL"/>
-        </w:rPr>
-      </w:pPr>
-      <w:r>
-        <w:rPr>
-          <w:rFonts w:ascii="Calibri" w:hAnsi="Calibri" w:cs="Calibri"/>
-          <w:lang w:val="en-IL" w:bidi="he-IL"/>
-        </w:rPr>
-        <w:t xml:space="preserve">In this talk, I will share the journey of building and training a DNA language model from scratch on an M2 MacBook with only 8 GB of memory. Rather than focusing on state-of-the-art performance, I </w:t>
-      </w:r>
-      <w:r>
-        <w:rPr>
-          <w:rFonts w:ascii="Calibri" w:hAnsi="Calibri" w:cs="Calibri"/>
-          <w:lang w:val="en-IL" w:bidi="he-IL"/>
-        </w:rPr>
-        <w:t xml:space="preserve">asked </w:t>
-      </w:r>
-      <w:r>
-        <w:rPr>
-          <w:rFonts w:ascii="Calibri" w:hAnsi="Calibri" w:cs="Calibri"/>
-          <w:lang w:val="en-IL" w:bidi="he-IL"/>
-        </w:rPr>
-        <w:t xml:space="preserve">a different question: how far can </w:t>
-      </w:r>
-      <w:r>
-        <w:rPr>
-          <w:rFonts w:ascii="Calibri" w:hAnsi="Calibri" w:cs="Calibri"/>
-          <w:lang w:val="en-IL" w:bidi="he-IL"/>
-        </w:rPr>
-        <w:t>I push</w:t>
-      </w:r>
       <w:r>
         <w:rPr>
           <w:rFonts w:ascii="Calibri" w:hAnsi="Calibri" w:cs="Calibri"/>
@@ -337,58 +861,14 @@
           <w:rFonts w:ascii="Calibri" w:hAnsi="Calibri" w:cs="Calibri"/>
           <w:lang w:val="en-IL" w:bidi="he-IL"/>
         </w:rPr>
-        <w:t>a language model when memory, not compute, is the main constraint?</w:t>
-      </w:r>
-    </w:p>
-    <w:p>
-      <w:pPr>
-        <w:jc w:val="both"/>
-        <w:rPr>
-          <w:rFonts w:ascii="Calibri" w:hAnsi="Calibri" w:cs="Calibri"/>
-          <w:lang w:val="en-IL" w:bidi="he-IL"/>
-        </w:rPr>
-      </w:pPr>
-      <w:r>
-        <w:rPr>
-          <w:rFonts w:ascii="Calibri" w:hAnsi="Calibri" w:cs="Calibri"/>
-          <w:lang w:val="en-IL" w:bidi="he-IL"/>
-        </w:rPr>
-        <w:t xml:space="preserve">We will explore the design decisions behind the project, including DNA </w:t>
-      </w:r>
-      <w:r>
-        <w:rPr>
-          <w:rFonts w:ascii="Calibri" w:hAnsi="Calibri" w:cs="Calibri"/>
-          <w:lang w:val="en-IL" w:bidi="he-IL"/>
-        </w:rPr>
-        <w:t xml:space="preserve">representation and </w:t>
-      </w:r>
-      <w:r>
-        <w:rPr>
-          <w:rFonts w:ascii="Calibri" w:hAnsi="Calibri" w:cs="Calibri"/>
-          <w:lang w:val="en-IL" w:bidi="he-IL"/>
-        </w:rPr>
-        <w:t xml:space="preserve">tokenization, </w:t>
-      </w:r>
-      <w:r>
-        <w:rPr>
-          <w:rFonts w:ascii="Calibri" w:hAnsi="Calibri" w:cs="Calibri"/>
-          <w:lang w:val="en-IL" w:bidi="he-IL"/>
-        </w:rPr>
-        <w:t xml:space="preserve">dataset preparation </w:t>
-      </w:r>
-      <w:r>
-        <w:rPr>
-          <w:rFonts w:ascii="Calibri" w:hAnsi="Calibri" w:cs="Calibri"/>
-          <w:lang w:val="en-IL" w:bidi="he-IL"/>
-        </w:rPr>
-        <w:t>, t</w:t>
-      </w:r>
-      <w:r>
-        <w:rPr>
-          <w:rFonts w:ascii="Calibri" w:hAnsi="Calibri" w:cs="Calibri"/>
-          <w:lang w:val="en-IL" w:bidi="he-IL"/>
-        </w:rPr>
-        <w:t>ransformer architecture choices,</w:t>
+        <w:t xml:space="preserve">How by </w:t>
+      </w:r>
+      <w:r>
+        <w:rPr>
+          <w:rFonts w:ascii="Calibri" w:hAnsi="Calibri" w:cs="Calibri"/>
+          <w:lang w:val="en-IL" w:bidi="he-IL"/>
+        </w:rPr>
+        <w:t>treating</w:t>
       </w:r>
       <w:r>
         <w:rPr>
@@ -402,7 +882,14 @@
           <w:rFonts w:ascii="Calibri" w:hAnsi="Calibri" w:cs="Calibri"/>
           <w:lang w:val="en-IL" w:bidi="he-IL"/>
         </w:rPr>
-        <w:t>memory-efficient training techniques, evaluation methods</w:t>
+        <w:t>hardware limitations as an opportunity</w:t>
+      </w:r>
+      <w:r>
+        <w:rPr>
+          <w:rFonts w:ascii="Calibri" w:hAnsi="Calibri" w:cs="Calibri"/>
+          <w:lang w:val="en-IL" w:bidi="he-IL"/>
+        </w:rPr>
+        <w:t>,</w:t>
       </w:r>
       <w:r>
         <w:rPr>
@@ -414,100 +901,44 @@
       <w:r>
         <w:rPr>
           <w:rFonts w:ascii="Calibri" w:hAnsi="Calibri" w:cs="Calibri"/>
-          <w:lang w:bidi="he-IL"/>
-        </w:rPr>
-        <w:t>and an unexpected shift from a single model to a small ecosystem of specialized models that generate, critique, and guide each other.</w:t>
-      </w:r>
-    </w:p>
-    <w:p>
-      <w:pPr>
-        <w:jc w:val="both"/>
-        <w:rPr>
-          <w:rFonts w:ascii="Calibri" w:hAnsi="Calibri" w:cs="Calibri"/>
-          <w:lang w:bidi="he-IL"/>
-        </w:rPr>
-      </w:pPr>
-      <w:r>
-        <w:rPr>
-          <w:rFonts w:ascii="Calibri" w:hAnsi="Calibri" w:cs="Calibri"/>
-          <w:lang w:val="en-IL" w:bidi="he-IL"/>
-        </w:rPr>
-        <w:t>Along the way, I will discuss the trade-offs between biological realism, model size, training time, and hardware limitations.</w:t>
-      </w:r>
-      <w:r>
-        <w:rPr>
-          <w:rFonts w:ascii="Calibri" w:hAnsi="Calibri" w:cs="Calibri"/>
-          <w:lang w:val="en-IL" w:bidi="he-IL"/>
-        </w:rPr>
-        <w:t xml:space="preserve"> </w:t>
-      </w:r>
-      <w:r>
-        <w:rPr>
-          <w:rFonts w:ascii="Calibri" w:hAnsi="Calibri" w:cs="Calibri"/>
-          <w:lang w:bidi="he-IL"/>
-        </w:rPr>
-        <w:t>We'll see where the model succeeds, where it fails, and</w:t>
-      </w:r>
-      <w:r>
-        <w:rPr>
-          <w:rFonts w:ascii="Calibri" w:hAnsi="Calibri" w:cs="Calibri"/>
-          <w:lang w:bidi="he-IL"/>
-        </w:rPr>
-        <w:t xml:space="preserve"> how far a laptop-trained model can realistically go</w:t>
-      </w:r>
-      <w:r>
-        <w:rPr>
-          <w:rFonts w:ascii="Calibri" w:hAnsi="Calibri" w:cs="Calibri"/>
-          <w:lang w:bidi="he-IL"/>
-        </w:rPr>
-        <w:t xml:space="preserve"> </w:t>
-      </w:r>
-      <w:r>
-        <w:rPr>
-          <w:rFonts w:ascii="Calibri" w:hAnsi="Calibri" w:cs="Calibri"/>
-          <w:lang w:val="en-IL" w:bidi="he-IL"/>
-        </w:rPr>
-        <w:t>and how I finally managed to teach my model to stop talking</w:t>
-      </w:r>
-      <w:r>
-        <w:rPr>
-          <w:rFonts w:ascii="Calibri" w:hAnsi="Calibri" w:cs="Calibri"/>
-          <w:lang w:val="en-IL" w:bidi="he-IL"/>
-        </w:rPr>
-        <w:t>.</w:t>
-      </w:r>
-    </w:p>
-    <w:p>
-      <w:pPr>
-        <w:jc w:val="both"/>
-        <w:rPr>
-          <w:rFonts w:ascii="Calibri" w:hAnsi="Calibri" w:cs="Calibri"/>
-          <w:lang w:bidi="he-IL"/>
-        </w:rPr>
-      </w:pPr>
-      <w:r>
-        <w:rPr>
-          <w:rFonts w:ascii="Calibri" w:hAnsi="Calibri" w:cs="Calibri"/>
-          <w:lang w:val="en-IL" w:bidi="he-IL"/>
-        </w:rPr>
-        <w:t>Attendees will leave with a practical understanding of what is required to train a domain-specific language model, which optimizations matter most on consumer hardware, and why building small models from scratch remains a powerful way to learn modern AI.</w:t>
-      </w:r>
-    </w:p>
-    <w:p>
-      <w:pPr>
-        <w:jc w:val="both"/>
-        <w:rPr>
-          <w:rFonts w:ascii="Calibri" w:hAnsi="Calibri" w:cs="Calibri"/>
-          <w:lang w:bidi="he-IL"/>
-        </w:rPr>
-      </w:pPr>
-      <w:r>
-        <w:rPr>
-          <w:rFonts w:ascii="Calibri" w:hAnsi="Calibri" w:cs="Calibri"/>
-          <w:lang w:bidi="he-IL"/>
-        </w:rPr>
-        <w:t>Bottlenecks I have</w:t>
-      </w:r>
+          <w:lang w:val="en-IL" w:bidi="he-IL"/>
+        </w:rPr>
+        <w:t xml:space="preserve">I ended up </w:t>
+      </w:r>
+      <w:r>
+        <w:rPr>
+          <w:rFonts w:ascii="Calibri" w:hAnsi="Calibri" w:cs="Calibri"/>
+          <w:lang w:val="en-IL" w:bidi="he-IL"/>
+        </w:rPr>
+        <w:t xml:space="preserve">learning. You will see my pipelines, infrastracture, </w:t>
+      </w:r>
+      <w:r>
+        <w:t>what small-scale genomics models can achieve and maybe even have some fun.</w:t>
+      </w:r>
+    </w:p>
+    <w:p>
+      <w:pPr>
+        <w:rPr>
+          <w:rFonts w:ascii="Calibri" w:hAnsi="Calibri" w:cs="Calibri"/>
+          <w:lang w:val="en-IL" w:bidi="he-IL"/>
+        </w:rPr>
+      </w:pPr>
+      <w:r>
+        <w:rPr>
+          <w:rFonts w:ascii="Calibri" w:hAnsi="Calibri" w:cs="Calibri"/>
+          <w:lang w:val="en-IL" w:bidi="he-IL"/>
+        </w:rPr>
+        <w:br w:type="page"/>
+      </w:r>
+    </w:p>
+    <w:p>
+      <w:pPr>
+        <w:jc w:val="both"/>
+        <w:rPr>
+          <w:rFonts w:ascii="Calibri" w:hAnsi="Calibri" w:cs="Calibri"/>
+          <w:lang w:bidi="he-IL"/>
+        </w:rPr>
+      </w:pPr>
     </w:p>
     <w:p>
       <w:pPr>
@@ -527,17 +958,36 @@
           <w:rFonts w:ascii="Calibri" w:hAnsi="Calibri" w:cs="Calibri"/>
           <w:lang w:bidi="he-IL"/>
         </w:rPr>
+        <w:t>Bottlenecks I have</w:t>
+      </w:r>
+    </w:p>
+    <w:p>
+      <w:pPr>
+        <w:pStyle w:val="ListParagraph"/>
+        <w:numPr>
+          <w:ilvl w:val="1"/>
+          <w:numId w:val="1"/>
+        </w:numPr>
+        <w:jc w:val="both"/>
+        <w:rPr>
+          <w:rFonts w:ascii="Calibri" w:hAnsi="Calibri" w:cs="Calibri"/>
+          <w:lang w:bidi="he-IL"/>
+        </w:rPr>
+      </w:pPr>
+      <w:r>
+        <w:rPr>
+          <w:rFonts w:ascii="Calibri" w:hAnsi="Calibri" w:cs="Calibri"/>
+          <w:lang w:bidi="he-IL"/>
+        </w:rPr>
         <w:t xml:space="preserve">RAM and GPU, compute time (I </w:t>
       </w:r>
-      <w:proofErr w:type="gramStart"/>
-      <w:r>
-        <w:rPr>
-          <w:rFonts w:ascii="Calibri" w:hAnsi="Calibri" w:cs="Calibri"/>
-          <w:lang w:bidi="he-IL"/>
-        </w:rPr>
-        <w:t>actually need</w:t>
-      </w:r>
-      <w:proofErr w:type="gramEnd"/>
+      <w:r>
+        <w:rPr>
+          <w:rFonts w:ascii="Calibri" w:hAnsi="Calibri" w:cs="Calibri"/>
+          <w:lang w:bidi="he-IL"/>
+        </w:rPr>
+        <w:t>need</w:t>
+      </w:r>
       <w:r>
         <w:rPr>
           <w:rFonts w:ascii="Calibri" w:hAnsi="Calibri" w:cs="Calibri"/>
@@ -571,7 +1021,67 @@
           <w:rFonts w:ascii="Calibri" w:hAnsi="Calibri" w:cs="Calibri"/>
           <w:lang w:bidi="he-IL"/>
         </w:rPr>
-        <w:t>low RAM that doesn’t allow to increase block_size or batch_size thus causing a high overhead of the dispatch-bound price.</w:t>
+        <w:t xml:space="preserve">low RAM that doesn’t allow to increase </w:t>
+      </w:r>
+      <w:proofErr w:type="spellStart"/>
+      <w:r>
+        <w:rPr>
+          <w:rFonts w:ascii="Calibri" w:hAnsi="Calibri" w:cs="Calibri"/>
+          <w:lang w:bidi="he-IL"/>
+        </w:rPr>
+        <w:t>block_size</w:t>
+      </w:r>
+      <w:proofErr w:type="spellEnd"/>
+      <w:r>
+        <w:rPr>
+          <w:rFonts w:ascii="Calibri" w:hAnsi="Calibri" w:cs="Calibri"/>
+          <w:lang w:bidi="he-IL"/>
+        </w:rPr>
+        <w:t xml:space="preserve"> or </w:t>
+      </w:r>
+      <w:proofErr w:type="spellStart"/>
+      <w:r>
+        <w:rPr>
+          <w:rFonts w:ascii="Calibri" w:hAnsi="Calibri" w:cs="Calibri"/>
+          <w:lang w:bidi="he-IL"/>
+        </w:rPr>
+        <w:t>batch_size</w:t>
+      </w:r>
+      <w:proofErr w:type="spellEnd"/>
+      <w:r>
+        <w:rPr>
+          <w:rFonts w:ascii="Calibri" w:hAnsi="Calibri" w:cs="Calibri"/>
+          <w:lang w:bidi="he-IL"/>
+        </w:rPr>
+        <w:t xml:space="preserve"> thus causing a high overhead of the dispatch-bound price.</w:t>
+      </w:r>
+    </w:p>
+    <w:p>
+      <w:pPr>
+        <w:pStyle w:val="ListParagraph"/>
+        <w:numPr>
+          <w:ilvl w:val="1"/>
+          <w:numId w:val="1"/>
+        </w:numPr>
+        <w:jc w:val="both"/>
+        <w:rPr>
+          <w:rFonts w:ascii="Calibri" w:hAnsi="Calibri" w:cs="Calibri"/>
+          <w:lang w:bidi="he-IL"/>
+        </w:rPr>
+      </w:pPr>
+      <w:r>
+        <w:rPr>
+          <w:rFonts w:ascii="Calibri" w:hAnsi="Calibri" w:cs="Calibri"/>
+          <w:lang w:bidi="he-IL"/>
+        </w:rPr>
+        <w:t xml:space="preserve">At the end </w:t>
+      </w:r>
+      <w:r>
+        <w:rPr>
+          <w:rFonts w:ascii="Calibri" w:hAnsi="Calibri" w:cs="Calibri"/>
+          <w:lang w:bidi="he-IL"/>
+        </w:rPr>
+        <w:t>train again on Emuna’s computer to “show” what I get when training on a much stronger machine!</w:t>
       </w:r>
     </w:p>
     <w:p>
@@ -592,31 +1102,77 @@
           <w:rFonts w:ascii="Calibri" w:hAnsi="Calibri" w:cs="Calibri"/>
           <w:lang w:bidi="he-IL"/>
         </w:rPr>
-        <w:t xml:space="preserve">At the end </w:t>
-      </w:r>
-      <w:r>
-        <w:rPr>
-          <w:rFonts w:ascii="Calibri" w:hAnsi="Calibri" w:cs="Calibri"/>
-          <w:lang w:bidi="he-IL"/>
-        </w:rPr>
-        <w:t>train again on Emuna’s computer to “show” what I get when training on a much stronger machine!</w:t>
-      </w:r>
-    </w:p>
-    <w:p>
-      <w:pPr>
-        <w:jc w:val="both"/>
-        <w:rPr>
-          <w:rFonts w:ascii="Calibri" w:hAnsi="Calibri" w:cs="Calibri"/>
-          <w:lang w:bidi="he-IL"/>
-        </w:rPr>
-      </w:pPr>
-      <w:r>
-        <w:rPr>
-          <w:rFonts w:ascii="Calibri" w:hAnsi="Calibri" w:cs="Calibri"/>
-          <w:lang w:bidi="he-IL"/>
-        </w:rPr>
-        <w:lastRenderedPageBreak/>
-        <w:t>Figure:</w:t>
+        <w:t>Figure</w:t>
+      </w:r>
+      <w:r>
+        <w:rPr>
+          <w:rFonts w:ascii="Calibri" w:hAnsi="Calibri" w:cs="Calibri"/>
+          <w:lang w:bidi="he-IL"/>
+        </w:rPr>
+        <w:t xml:space="preserve"> ideas</w:t>
+      </w:r>
+      <w:r>
+        <w:rPr>
+          <w:rFonts w:ascii="Calibri" w:hAnsi="Calibri" w:cs="Calibri"/>
+          <w:lang w:bidi="he-IL"/>
+        </w:rPr>
+        <w:t>:</w:t>
+      </w:r>
+    </w:p>
+    <w:p>
+      <w:pPr>
+        <w:pStyle w:val="ListParagraph"/>
+        <w:numPr>
+          <w:ilvl w:val="1"/>
+          <w:numId w:val="1"/>
+        </w:numPr>
+        <w:jc w:val="both"/>
+        <w:rPr>
+          <w:rFonts w:ascii="Calibri" w:hAnsi="Calibri" w:cs="Calibri"/>
+          <w:lang w:bidi="he-IL"/>
+        </w:rPr>
+      </w:pPr>
+      <w:r>
+        <w:rPr>
+          <w:rFonts w:ascii="Calibri" w:hAnsi="Calibri" w:cs="Calibri"/>
+          <w:lang w:bidi="he-IL"/>
+        </w:rPr>
+        <w:t>A figure that shows that as I increase the architecture performance improves.</w:t>
+      </w:r>
+    </w:p>
+    <w:p>
+      <w:pPr>
+        <w:pStyle w:val="ListParagraph"/>
+        <w:numPr>
+          <w:ilvl w:val="1"/>
+          <w:numId w:val="1"/>
+        </w:numPr>
+        <w:jc w:val="both"/>
+        <w:rPr>
+          <w:rFonts w:ascii="Calibri" w:hAnsi="Calibri" w:cs="Calibri"/>
+          <w:lang w:bidi="he-IL"/>
+        </w:rPr>
+      </w:pPr>
+      <w:r>
+        <w:rPr>
+          <w:rFonts w:ascii="Calibri" w:hAnsi="Calibri" w:cs="Calibri"/>
+          <w:lang w:bidi="he-IL"/>
+        </w:rPr>
+        <w:t xml:space="preserve">A figure that shows that as I increase the dataset size performance changes, </w:t>
+      </w:r>
+      <w:r>
+        <w:rPr>
+          <w:rFonts w:ascii="Calibri" w:hAnsi="Calibri" w:cs="Calibri"/>
+          <w:lang w:bidi="he-IL"/>
+        </w:rPr>
+        <w:t>degrades</w:t>
+      </w:r>
+      <w:r>
+        <w:rPr>
+          <w:rFonts w:ascii="Calibri" w:hAnsi="Calibri" w:cs="Calibri"/>
+          <w:lang w:bidi="he-IL"/>
+        </w:rPr>
+        <w:t xml:space="preserve"> in some parts but the model learns new patterns.</w:t>
       </w:r>
     </w:p>
     <w:p>
@@ -637,14 +1193,21 @@
           <w:rFonts w:ascii="Calibri" w:hAnsi="Calibri" w:cs="Calibri"/>
           <w:lang w:bidi="he-IL"/>
         </w:rPr>
-        <w:t>A figure that shows that as I increase the architecture performance improves.</w:t>
+        <w:t>General i</w:t>
+      </w:r>
+      <w:r>
+        <w:rPr>
+          <w:rFonts w:ascii="Calibri" w:hAnsi="Calibri" w:cs="Calibri"/>
+          <w:lang w:bidi="he-IL"/>
+        </w:rPr>
+        <w:t>deas:</w:t>
       </w:r>
     </w:p>
     <w:p>
       <w:pPr>
         <w:pStyle w:val="ListParagraph"/>
         <w:numPr>
-          <w:ilvl w:val="0"/>
+          <w:ilvl w:val="1"/>
           <w:numId w:val="1"/>
         </w:numPr>
         <w:jc w:val="both"/>
@@ -658,44 +1221,42 @@
           <w:rFonts w:ascii="Calibri" w:hAnsi="Calibri" w:cs="Calibri"/>
           <w:lang w:bidi="he-IL"/>
         </w:rPr>
-        <w:t xml:space="preserve">A figure that shows that as I increase the dataset size performance changes, </w:t>
-      </w:r>
-      <w:r>
-        <w:rPr>
-          <w:rFonts w:ascii="Calibri" w:hAnsi="Calibri" w:cs="Calibri"/>
-          <w:lang w:bidi="he-IL"/>
-        </w:rPr>
-        <w:t>degrades</w:t>
-      </w:r>
-      <w:r>
-        <w:rPr>
-          <w:rFonts w:ascii="Calibri" w:hAnsi="Calibri" w:cs="Calibri"/>
-          <w:lang w:bidi="he-IL"/>
-        </w:rPr>
-        <w:t xml:space="preserve"> in some parts but the model learns new patterns.</w:t>
-      </w:r>
-    </w:p>
-    <w:p>
-      <w:pPr>
-        <w:jc w:val="both"/>
-        <w:rPr>
-          <w:rFonts w:ascii="Calibri" w:hAnsi="Calibri" w:cs="Calibri"/>
-          <w:lang w:bidi="he-IL"/>
-        </w:rPr>
-      </w:pPr>
-      <w:r>
-        <w:rPr>
-          <w:rFonts w:ascii="Calibri" w:hAnsi="Calibri" w:cs="Calibri"/>
-          <w:lang w:bidi="he-IL"/>
-        </w:rPr>
-        <w:t>Ideas:</w:t>
+        <w:t>I would have wanted the model to be train</w:t>
+      </w:r>
+      <w:r>
+        <w:rPr>
+          <w:rFonts w:ascii="Calibri" w:hAnsi="Calibri" w:cs="Calibri"/>
+          <w:lang w:bidi="he-IL"/>
+        </w:rPr>
+        <w:t>ed</w:t>
+      </w:r>
+      <w:r>
+        <w:rPr>
+          <w:rFonts w:ascii="Calibri" w:hAnsi="Calibri" w:cs="Calibri"/>
+          <w:lang w:bidi="he-IL"/>
+        </w:rPr>
+        <w:t xml:space="preserve"> </w:t>
+      </w:r>
+      <w:r>
+        <w:rPr>
+          <w:rFonts w:ascii="Calibri" w:hAnsi="Calibri" w:cs="Calibri"/>
+          <w:lang w:bidi="he-IL"/>
+        </w:rPr>
+        <w:t xml:space="preserve">on me, but the human DNA is too large and </w:t>
+      </w:r>
+      <w:r>
+        <w:rPr>
+          <w:rFonts w:ascii="Calibri" w:hAnsi="Calibri" w:cs="Calibri"/>
+          <w:lang w:bidi="he-IL"/>
+        </w:rPr>
+        <w:t>complex to realistically do on my laptop, so I went smaller and took some bacteria.</w:t>
       </w:r>
     </w:p>
     <w:p>
       <w:pPr>
         <w:pStyle w:val="ListParagraph"/>
         <w:numPr>
-          <w:ilvl w:val="0"/>
+          <w:ilvl w:val="1"/>
           <w:numId w:val="1"/>
         </w:numPr>
         <w:jc w:val="both"/>
@@ -709,42 +1270,14 @@
           <w:rFonts w:ascii="Calibri" w:hAnsi="Calibri" w:cs="Calibri"/>
           <w:lang w:bidi="he-IL"/>
         </w:rPr>
-        <w:t>I would have wanted the model to be train</w:t>
-      </w:r>
-      <w:r>
-        <w:rPr>
-          <w:rFonts w:ascii="Calibri" w:hAnsi="Calibri" w:cs="Calibri"/>
-          <w:lang w:bidi="he-IL"/>
-        </w:rPr>
-        <w:t>ed</w:t>
-      </w:r>
-      <w:r>
-        <w:rPr>
-          <w:rFonts w:ascii="Calibri" w:hAnsi="Calibri" w:cs="Calibri"/>
-          <w:lang w:bidi="he-IL"/>
-        </w:rPr>
-        <w:t xml:space="preserve"> </w:t>
-      </w:r>
-      <w:r>
-        <w:rPr>
-          <w:rFonts w:ascii="Calibri" w:hAnsi="Calibri" w:cs="Calibri"/>
-          <w:lang w:bidi="he-IL"/>
-        </w:rPr>
-        <w:t xml:space="preserve">on me, but the human DNA is too large and </w:t>
-      </w:r>
-      <w:r>
-        <w:rPr>
-          <w:rFonts w:ascii="Calibri" w:hAnsi="Calibri" w:cs="Calibri"/>
-          <w:lang w:bidi="he-IL"/>
-        </w:rPr>
-        <w:t>complex to realistically do on my laptop, so I went smaller and took some bacteria.</w:t>
+        <w:t>Go from single model to a full suite with specialized models that correct and direct each other.</w:t>
       </w:r>
     </w:p>
     <w:p>
       <w:pPr>
         <w:pStyle w:val="ListParagraph"/>
         <w:numPr>
-          <w:ilvl w:val="0"/>
+          <w:ilvl w:val="1"/>
           <w:numId w:val="1"/>
         </w:numPr>
         <w:jc w:val="both"/>
@@ -758,7 +1291,7 @@
           <w:rFonts w:ascii="Calibri" w:hAnsi="Calibri" w:cs="Calibri"/>
           <w:lang w:bidi="he-IL"/>
         </w:rPr>
-        <w:t>Go from single model to a full suite with specialized models that correct and direct each other.</w:t>
+        <w:t>Models are like me, they like to talk indefinitely so, again, like me, I had to teach it how to stop “talking”, generating more tokens for the DNA sequence.</w:t>
       </w:r>
     </w:p>
     <w:p>
@@ -855,19 +1388,43 @@
         </w:rPr>
       </w:pPr>
       <w:r>
-        <w:t xml:space="preserve">            • PyTorch's native Scaled Dot Product Attention (SDPA) and Grouped Query Attention (GQA) on Apple Silicon (mps).</w:t>
-      </w:r>
-    </w:p>
-    <w:p>
-      <w:pPr>
-        <w:jc w:val="both"/>
-        <w:rPr>
-          <w:rFonts w:ascii="Calibri" w:hAnsi="Calibri" w:cs="Calibri"/>
-          <w:lang w:bidi="he-IL"/>
-        </w:rPr>
-      </w:pPr>
-      <w:r>
-        <w:t xml:space="preserve">            • Using gradient accumulation to simulate large batch sizes without OOMing.</w:t>
+        <w:t xml:space="preserve">            • </w:t>
+      </w:r>
+      <w:proofErr w:type="spellStart"/>
+      <w:r>
+        <w:t>PyTorch's</w:t>
+      </w:r>
+      <w:proofErr w:type="spellEnd"/>
+      <w:r>
+        <w:t xml:space="preserve"> native Scaled Dot Product Attention (SDPA) and Grouped Query Attention (GQA) on Apple Silicon (</w:t>
+      </w:r>
+      <w:proofErr w:type="spellStart"/>
+      <w:r>
+        <w:t>mps</w:t>
+      </w:r>
+      <w:proofErr w:type="spellEnd"/>
+      <w:r>
+        <w:t>).</w:t>
+      </w:r>
+    </w:p>
+    <w:p>
+      <w:pPr>
+        <w:jc w:val="both"/>
+        <w:rPr>
+          <w:rFonts w:ascii="Calibri" w:hAnsi="Calibri" w:cs="Calibri"/>
+          <w:lang w:bidi="he-IL"/>
+        </w:rPr>
+      </w:pPr>
+      <w:r>
+        <w:t xml:space="preserve">            • Using gradient accumulation to simulate large batch sizes without </w:t>
+      </w:r>
+      <w:proofErr w:type="spellStart"/>
+      <w:r>
+        <w:t>OOMing</w:t>
+      </w:r>
+      <w:proofErr w:type="spellEnd"/>
+      <w:r>
+        <w:t>.</w:t>
       </w:r>
     </w:p>
     <w:p>
@@ -891,18 +1448,35 @@
         </w:rPr>
       </w:pPr>
       <w:r>
-        <w:t xml:space="preserve">            • Decoupling DNA generation (CodonLM) from multi-task protein function validation (ProteinLM).</w:t>
-      </w:r>
-    </w:p>
-    <w:p>
-      <w:pPr>
-        <w:jc w:val="both"/>
-        <w:rPr>
-          <w:rFonts w:ascii="Calibri" w:hAnsi="Calibri" w:cs="Calibri"/>
-          <w:lang w:bidi="he-IL"/>
-        </w:rPr>
-      </w:pPr>
-      <w:r>
+        <w:t xml:space="preserve">            • Decoupling DNA generation (</w:t>
+      </w:r>
+      <w:proofErr w:type="spellStart"/>
+      <w:r>
+        <w:t>CodonLM</w:t>
+      </w:r>
+      <w:proofErr w:type="spellEnd"/>
+      <w:r>
+        <w:t>) from multi-task protein function validation (</w:t>
+      </w:r>
+      <w:proofErr w:type="spellStart"/>
+      <w:r>
+        <w:t>ProteinLM</w:t>
+      </w:r>
+      <w:proofErr w:type="spellEnd"/>
+      <w:r>
+        <w:t>).</w:t>
+      </w:r>
+    </w:p>
+    <w:p>
+      <w:pPr>
+        <w:jc w:val="both"/>
+        <w:rPr>
+          <w:rFonts w:ascii="Calibri" w:hAnsi="Calibri" w:cs="Calibri"/>
+          <w:lang w:bidi="he-IL"/>
+        </w:rPr>
+      </w:pPr>
+      <w:r>
+        <w:lastRenderedPageBreak/>
         <w:t xml:space="preserve">            • Translating DNA to amino acids on-the-fly and using a lightweight Critic to guide generation.</w:t>
       </w:r>
     </w:p>
@@ -915,7 +1489,15 @@
         </w:rPr>
       </w:pPr>
       <w:r>
-        <w:t xml:space="preserve">            • Shifting sequence design success rate from sublinear to linear using Reset-and-Discard (ReD) sampling.</w:t>
+        <w:t xml:space="preserve">            • Shifting sequence design success rate from sublinear to linear using Reset-and-Discard (</w:t>
+      </w:r>
+      <w:proofErr w:type="spellStart"/>
+      <w:r>
+        <w:t>ReD</w:t>
+      </w:r>
+      <w:proofErr w:type="spellEnd"/>
+      <w:r>
+        <w:t>) sampling.</w:t>
       </w:r>
     </w:p>
     <w:p>
@@ -963,7 +1545,6 @@
         </w:rPr>
       </w:pPr>
       <w:r>
-        <w:lastRenderedPageBreak/>
         <w:t xml:space="preserve">        5. Key Takeaways &amp; Encouragement (2 mins):</w:t>
       </w:r>
     </w:p>
@@ -1075,7 +1656,15 @@
         <w:pStyle w:val="Heading2"/>
       </w:pPr>
       <w:r>
-        <w:t>3. Add k-mer baseline to Section 4 (Data Engineering, 2 min)</w:t>
+        <w:t>3. Add k-</w:t>
+      </w:r>
+      <w:proofErr w:type="spellStart"/>
+      <w:r>
+        <w:t>mer</w:t>
+      </w:r>
+      <w:proofErr w:type="spellEnd"/>
+      <w:r>
+        <w:t xml:space="preserve"> baseline to Section 4 (Data Engineering, 2 min)</w:t>
       </w:r>
     </w:p>
     <w:p>
@@ -1102,12 +1691,28 @@
       </w:pPr>
       <w:r>
         <w:lastRenderedPageBreak/>
-        <w:t>4. Add DNAshape as a "surprise" sub-bullet in Section 3</w:t>
-      </w:r>
-    </w:p>
-    <w:p>
-      <w:r>
-        <w:t>Section 3 covers Generator-Critic and ReD but is all procedural. Add as a sub-bullet:</w:t>
+        <w:t xml:space="preserve">4. Add </w:t>
+      </w:r>
+      <w:proofErr w:type="spellStart"/>
+      <w:r>
+        <w:t>DNAshape</w:t>
+      </w:r>
+      <w:proofErr w:type="spellEnd"/>
+      <w:r>
+        <w:t xml:space="preserve"> as a "surprise" sub-bullet in Section 3</w:t>
+      </w:r>
+    </w:p>
+    <w:p>
+      <w:r>
+        <w:t xml:space="preserve">Section 3 covers Generator-Critic and </w:t>
+      </w:r>
+      <w:proofErr w:type="spellStart"/>
+      <w:r>
+        <w:t>ReD</w:t>
+      </w:r>
+      <w:proofErr w:type="spellEnd"/>
+      <w:r>
+        <w:t xml:space="preserve"> but is all procedural. Add as a sub-bullet:</w:t>
       </w:r>
     </w:p>
     <w:p>
@@ -1292,7 +1897,15 @@
           </w:tcPr>
           <w:p>
             <w:r>
-              <w:t>K-mer baseline</w:t>
+              <w:t>K-</w:t>
+            </w:r>
+            <w:proofErr w:type="spellStart"/>
+            <w:r>
+              <w:t>mer</w:t>
+            </w:r>
+            <w:proofErr w:type="spellEnd"/>
+            <w:r>
+              <w:t xml:space="preserve"> baseline</w:t>
             </w:r>
           </w:p>
         </w:tc>
@@ -1323,8 +1936,13 @@
             <w:tcW w:w="3120" w:type="dxa"/>
           </w:tcPr>
           <w:p>
+            <w:proofErr w:type="spellStart"/>
             <w:r>
-              <w:t>DNAshape regression</w:t>
+              <w:t>DNAshape</w:t>
+            </w:r>
+            <w:proofErr w:type="spellEnd"/>
+            <w:r>
+              <w:t xml:space="preserve"> regression</w:t>
             </w:r>
           </w:p>
         </w:tc>
@@ -1436,7 +2054,15 @@
       </w:pPr>
       <w:r>
         <w:lastRenderedPageBreak/>
-        <w:t>Method: Codon-level GPT + Generator-Critic loop + ReD sampling.</w:t>
+        <w:t xml:space="preserve">Method: Codon-level GPT + Generator-Critic loop + </w:t>
+      </w:r>
+      <w:proofErr w:type="spellStart"/>
+      <w:r>
+        <w:t>ReD</w:t>
+      </w:r>
+      <w:proofErr w:type="spellEnd"/>
+      <w:r>
+        <w:t xml:space="preserve"> sampling.</w:t>
       </w:r>
     </w:p>
     <w:p>
@@ -1444,7 +2070,15 @@
         <w:pStyle w:val="ListParagraph"/>
       </w:pPr>
       <w:r>
-        <w:t>Headline result: AMR AUROC=0.967, DNAshape R²=0.569, +2.5× F1 over TF-IDF baseline.</w:t>
+        <w:t xml:space="preserve">Headline result: AMR AUROC=0.967, </w:t>
+      </w:r>
+      <w:proofErr w:type="spellStart"/>
+      <w:r>
+        <w:t>DNAshape</w:t>
+      </w:r>
+      <w:proofErr w:type="spellEnd"/>
+      <w:r>
+        <w:t xml:space="preserve"> R²=0.569, +2.5× F1 over TF-IDF baseline.</w:t>
       </w:r>
     </w:p>
     <w:p>
@@ -1491,7 +2125,7 @@
         <w:rFonts w:ascii="Symbol" w:eastAsiaTheme="minorEastAsia" w:hAnsi="Symbol" w:cs="Calibri" w:hint="default"/>
       </w:rPr>
     </w:lvl>
-    <w:lvl w:ilvl="1" w:tplc="04090003" w:tentative="1">
+    <w:lvl w:ilvl="1" w:tplc="04090003">
       <w:start w:val="1"/>
       <w:numFmt w:val="bullet"/>
       <w:lvlText w:val="o"/>
@@ -1588,10 +2222,133 @@
       </w:rPr>
     </w:lvl>
   </w:abstractNum>
+  <w:abstractNum w:abstractNumId="1" w15:restartNumberingAfterBreak="0">
+    <w:nsid w:val="57662715"/>
+    <w:multiLevelType w:val="hybridMultilevel"/>
+    <w:tmpl w:val="25881C36"/>
+    <w:lvl w:ilvl="0" w:tplc="9086C7D0">
+      <w:numFmt w:val="bullet"/>
+      <w:lvlText w:val=""/>
+      <w:lvlJc w:val="left"/>
+      <w:pPr>
+        <w:ind w:left="720" w:hanging="360"/>
+      </w:pPr>
+      <w:rPr>
+        <w:rFonts w:ascii="Symbol" w:eastAsiaTheme="minorEastAsia" w:hAnsi="Symbol" w:cs="Calibri" w:hint="default"/>
+      </w:rPr>
+    </w:lvl>
+    <w:lvl w:ilvl="1" w:tplc="04090003" w:tentative="1">
+      <w:start w:val="1"/>
+      <w:numFmt w:val="bullet"/>
+      <w:lvlText w:val="o"/>
+      <w:lvlJc w:val="left"/>
+      <w:pPr>
+        <w:ind w:left="1440" w:hanging="360"/>
+      </w:pPr>
+      <w:rPr>
+        <w:rFonts w:ascii="Courier New" w:hAnsi="Courier New" w:cs="Courier New" w:hint="default"/>
+      </w:rPr>
+    </w:lvl>
+    <w:lvl w:ilvl="2" w:tplc="04090005" w:tentative="1">
+      <w:start w:val="1"/>
+      <w:numFmt w:val="bullet"/>
+      <w:lvlText w:val=""/>
+      <w:lvlJc w:val="left"/>
+      <w:pPr>
+        <w:ind w:left="2160" w:hanging="360"/>
+      </w:pPr>
+      <w:rPr>
+        <w:rFonts w:ascii="Wingdings" w:hAnsi="Wingdings" w:hint="default"/>
+      </w:rPr>
+    </w:lvl>
+    <w:lvl w:ilvl="3" w:tplc="04090001" w:tentative="1">
+      <w:start w:val="1"/>
+      <w:numFmt w:val="bullet"/>
+      <w:lvlText w:val=""/>
+      <w:lvlJc w:val="left"/>
+      <w:pPr>
+        <w:ind w:left="2880" w:hanging="360"/>
+      </w:pPr>
+      <w:rPr>
+        <w:rFonts w:ascii="Symbol" w:hAnsi="Symbol" w:hint="default"/>
+      </w:rPr>
+    </w:lvl>
+    <w:lvl w:ilvl="4" w:tplc="04090003" w:tentative="1">
+      <w:start w:val="1"/>
+      <w:numFmt w:val="bullet"/>
+      <w:lvlText w:val="o"/>
+      <w:lvlJc w:val="left"/>
+      <w:pPr>
+        <w:ind w:left="3600" w:hanging="360"/>
+      </w:pPr>
+      <w:rPr>
+        <w:rFonts w:ascii="Courier New" w:hAnsi="Courier New" w:cs="Courier New" w:hint="default"/>
+      </w:rPr>
+    </w:lvl>
+    <w:lvl w:ilvl="5" w:tplc="04090005" w:tentative="1">
+      <w:start w:val="1"/>
+      <w:numFmt w:val="bullet"/>
+      <w:lvlText w:val=""/>
+      <w:lvlJc w:val="left"/>
+      <w:pPr>
+        <w:ind w:left="4320" w:hanging="360"/>
+      </w:pPr>
+      <w:rPr>
+        <w:rFonts w:ascii="Wingdings" w:hAnsi="Wingdings" w:hint="default"/>
+      </w:rPr>
+    </w:lvl>
+    <w:lvl w:ilvl="6" w:tplc="04090001" w:tentative="1">
+      <w:start w:val="1"/>
+      <w:numFmt w:val="bullet"/>
+      <w:lvlText w:val=""/>
+      <w:lvlJc w:val="left"/>
+      <w:pPr>
+        <w:ind w:left="5040" w:hanging="360"/>
+      </w:pPr>
+      <w:rPr>
+        <w:rFonts w:ascii="Symbol" w:hAnsi="Symbol" w:hint="default"/>
+      </w:rPr>
+    </w:lvl>
+    <w:lvl w:ilvl="7" w:tplc="04090003" w:tentative="1">
+      <w:start w:val="1"/>
+      <w:numFmt w:val="bullet"/>
+      <w:lvlText w:val="o"/>
+      <w:lvlJc w:val="left"/>
+      <w:pPr>
+        <w:ind w:left="5760" w:hanging="360"/>
+      </w:pPr>
+      <w:rPr>
+        <w:rFonts w:ascii="Courier New" w:hAnsi="Courier New" w:cs="Courier New" w:hint="default"/>
+      </w:rPr>
+    </w:lvl>
+    <w:lvl w:ilvl="8" w:tplc="04090005" w:tentative="1">
+      <w:start w:val="1"/>
+      <w:numFmt w:val="bullet"/>
+      <w:lvlText w:val=""/>
+      <w:lvlJc w:val="left"/>
+      <w:pPr>
+        <w:ind w:left="6480" w:hanging="360"/>
+      </w:pPr>
+      <w:rPr>
+        <w:rFonts w:ascii="Wingdings" w:hAnsi="Wingdings" w:hint="default"/>
+      </w:rPr>
+    </w:lvl>
+  </w:abstractNum>
   <w:num w:numId="1" w16cid:durableId="956716327">
     <w:abstractNumId w:val="0"/>
   </w:num>
+  <w:num w:numId="2" w16cid:durableId="268005618">
+    <w:abstractNumId w:val="1"/>
+  </w:num>
 </w:numbering>
+</file>
+
+<file path=word/people.xml><?xml version="1.0" encoding="utf-8"?>
+<w15:people xmlns:wpc="http://schemas.microsoft.com/office/word/2010/wordprocessingCanvas" xmlns:cx="http://schemas.microsoft.com/office/drawing/2014/chartex" xmlns:cx1="http://schemas.microsoft.com/office/drawing/2015/9/8/chartex" xmlns:cx2="http://schemas.microsoft.com/office/drawing/2015/10/21/chartex" xmlns:cx3="http://schemas.microsoft.com/office/drawing/2016/5/9/chartex" xmlns:cx4="http://schemas.microsoft.com/office/drawing/2016/5/10/chartex" xmlns:cx5="http://schemas.microsoft.com/office/drawing/2016/5/11/chartex" xmlns:cx6="http://schemas.microsoft.com/office/drawing/2016/5/12/chartex" xmlns:cx7="http://schemas.microsoft.com/office/drawing/2016/5/13/chartex" xmlns:cx8="http://schemas.microsoft.com/office/drawing/2016/5/14/chartex" xmlns:mc="http://schemas.openxmlformats.org/markup-compatibility/2006" xmlns:aink="http://schemas.microsoft.com/office/drawing/2016/ink" xmlns:am3d="http://schemas.microsoft.com/office/drawing/2017/model3d" xmlns:o="urn:schemas-microsoft-com:office:office" xmlns:oel="http://schemas.microsoft.com/office/2019/extlst" xmlns:r="http://schemas.openxmlformats.org/officeDocument/2006/relationships" xmlns:m="http://schemas.openxmlformats.org/officeDocument/2006/math" xmlns:v="urn:schemas-microsoft-com:vml" xmlns:wp14="http://schemas.microsoft.com/office/word/2010/wordprocessingDrawing" xmlns:wp="http://schemas.openxmlformats.org/drawingml/2006/wordprocessingDrawing" xmlns:w10="urn:schemas-microsoft-com:office:word" xmlns:w="http://schemas.openxmlformats.org/wordprocessingml/2006/main" xmlns:w14="http://schemas.microsoft.com/office/word/2010/wordml" xmlns:w15="http://schemas.microsoft.com/office/word/2012/wordml" xmlns:w16cex="http://schemas.microsoft.com/office/word/2018/wordml/cex" xmlns:w16cid="http://schemas.microsoft.com/office/word/2016/wordml/cid" xmlns:w16="http://schemas.microsoft.com/office/word/2018/wordml" xmlns:w16du="http://schemas.microsoft.com/office/word/2023/wordml/word16du" xmlns:w16sdtdh="http://schemas.microsoft.com/office/word/2020/wordml/sdtdatahash" xmlns:w16sdtfl="http://schemas.microsoft.com/office/word/2024/wordml/sdtformatlock" xmlns:w16se="http://schemas.microsoft.com/office/word/2015/wordml/symex" xmlns:wpg="http://schemas.microsoft.com/office/word/2010/wordprocessingGroup" xmlns:wpi="http://schemas.microsoft.com/office/word/2010/wordprocessingInk" xmlns:wne="http://schemas.microsoft.com/office/word/2006/wordml" xmlns:wps="http://schemas.microsoft.com/office/word/2010/wordprocessingShape" mc:Ignorable="w14 w15 w16se w16cid w16 w16cex w16sdtdh w16sdtfl w16du wp14">
+  <w15:person w15:author="Avishai Barnoy">
+    <w15:presenceInfo w15:providerId="Windows Live" w15:userId="fdcd07763bccab86"/>
+  </w15:person>
+</w15:people>
 </file>
 
 <file path=word/styles.xml><?xml version="1.0" encoding="utf-8"?>
@@ -2199,7 +2956,6 @@
   <w:style w:type="character" w:default="1" w:styleId="DefaultParagraphFont">
     <w:name w:val="Default Paragraph Font"/>
     <w:uiPriority w:val="1"/>
-    <w:semiHidden/>
     <w:unhideWhenUsed/>
   </w:style>
   <w:style w:type="table" w:default="1" w:styleId="TableNormal">
@@ -2535,6 +3291,24 @@
       <w:spacing w:val="5"/>
     </w:rPr>
   </w:style>
+  <w:style w:type="paragraph" w:styleId="Revision">
+    <w:name w:val="Revision"/>
+    <w:hidden/>
+    <w:uiPriority w:val="99"/>
+    <w:semiHidden/>
+    <w:rsid w:val="009F7E4D"/>
+    <w:pPr>
+      <w:spacing w:after="0" w:line="240" w:lineRule="auto"/>
+    </w:pPr>
+    <w:rPr>
+      <w:lang w:val="en-US"/>
+    </w:rPr>
+  </w:style>
+  <w:style w:type="character" w:customStyle="1" w:styleId="horizontal-container">
+    <w:name w:val="horizontal-container"/>
+    <w:basedOn w:val="DefaultParagraphFont"/>
+    <w:rsid w:val="00ED3EFD"/>
+  </w:style>
 </w:styles>
 </file>
 
@@ -2831,4 +3605,16 @@
     </a:ext>
   </a:extLst>
 </a:theme>
+</file>
+
+<file path=customXml/item1.xml><?xml version="1.0" encoding="utf-8"?>
+<b:Sources xmlns:b="http://schemas.openxmlformats.org/officeDocument/2006/bibliography" xmlns="http://schemas.openxmlformats.org/officeDocument/2006/bibliography" SelectedStyle="/APASixthEditionOfficeOnline.xsl" StyleName="APA" Version="6"/>
+</file>
+
+<file path=customXml/itemProps1.xml><?xml version="1.0" encoding="utf-8"?>
+<ds:datastoreItem xmlns:ds="http://schemas.openxmlformats.org/officeDocument/2006/customXml" ds:itemID="{53695D63-1FB4-1442-A95D-3A312495ACE2}">
+  <ds:schemaRefs>
+    <ds:schemaRef ds:uri="http://schemas.openxmlformats.org/officeDocument/2006/bibliography"/>
+  </ds:schemaRefs>
+</ds:datastoreItem>
 </file>
</xml_diff>